<commit_message>
docs: fix Arch/CachyOS installer + QUICKSTART (venv --system-site-packages, fish activation, correct pacman names)
</commit_message>
<xml_diff>
--- a/QUICKSTART.docx
+++ b/QUICKSTART.docx
@@ -2,7 +2,7 @@
 <file path=word/document.xml><?xml version="1.0" encoding="utf-8"?>
 <w:document xmlns:w="http://schemas.openxmlformats.org/wordprocessingml/2006/main" xmlns:m="http://schemas.openxmlformats.org/officeDocument/2006/math" xmlns:r="http://schemas.openxmlformats.org/officeDocument/2006/relationships" xmlns:o="urn:schemas-microsoft-com:office:office" xmlns:v="urn:schemas-microsoft-com:vml" xmlns:w10="urn:schemas-microsoft-com:office:word" xmlns:a="http://schemas.openxmlformats.org/drawingml/2006/main" xmlns:pic="http://schemas.openxmlformats.org/drawingml/2006/picture" xmlns:wp="http://schemas.openxmlformats.org/drawingml/2006/wordprocessingDrawing">
   <w:body>
-    <w:bookmarkStart w:id="26" w:name="sdr-hunter-quick-start"/>
+    <w:bookmarkStart w:id="27" w:name="sdr-hunter-quick-start"/>
     <w:p>
       <w:pPr>
         <w:pStyle w:val="Heading1"/>
@@ -11,7 +11,7 @@
         <w:t xml:space="preserve">SDR Hunter — Quick Start</w:t>
       </w:r>
     </w:p>
-    <w:bookmarkStart w:id="20" w:name="install"/>
+    <w:bookmarkStart w:id="21" w:name="install"/>
     <w:p>
       <w:pPr>
         <w:pStyle w:val="Heading2"/>
@@ -79,124 +79,13 @@
         <w:t xml:space="preserve">./install_drivers.sh</w:t>
       </w:r>
     </w:p>
-    <w:bookmarkEnd w:id="20"/>
-    <w:bookmarkStart w:id="21" w:name="run"/>
-    <w:p>
-      <w:pPr>
-        <w:pStyle w:val="Heading2"/>
-      </w:pPr>
-      <w:r>
-        <w:t xml:space="preserve">2. Run</w:t>
-      </w:r>
-    </w:p>
-    <w:p>
-      <w:pPr>
-        <w:pStyle w:val="SourceCode"/>
-      </w:pPr>
-      <w:r>
-        <w:rPr>
-          <w:rStyle w:val="ExtensionTok"/>
-        </w:rPr>
-        <w:t xml:space="preserve">./launch.sh</w:t>
-      </w:r>
-      <w:r>
-        <w:rPr>
-          <w:rStyle w:val="NormalTok"/>
-        </w:rPr>
-        <w:t xml:space="preserve">                 </w:t>
-      </w:r>
-      <w:r>
-        <w:rPr>
-          <w:rStyle w:val="CommentTok"/>
-        </w:rPr>
-        <w:t xml:space="preserve"># desktop GUI (same as: python3 main.py --gui)</w:t>
-      </w:r>
-      <w:r>
-        <w:br/>
-      </w:r>
-      <w:r>
-        <w:rPr>
-          <w:rStyle w:val="ExtensionTok"/>
-        </w:rPr>
-        <w:t xml:space="preserve">python3</w:t>
-      </w:r>
-      <w:r>
-        <w:rPr>
-          <w:rStyle w:val="NormalTok"/>
-        </w:rPr>
-        <w:t xml:space="preserve"> main.py </w:t>
-      </w:r>
-      <w:r>
-        <w:rPr>
-          <w:rStyle w:val="AttributeTok"/>
-        </w:rPr>
-        <w:t xml:space="preserve">--web</w:t>
-      </w:r>
-      <w:r>
-        <w:rPr>
-          <w:rStyle w:val="NormalTok"/>
-        </w:rPr>
-        <w:t xml:space="preserve">       </w:t>
-      </w:r>
-      <w:r>
-        <w:rPr>
-          <w:rStyle w:val="CommentTok"/>
-        </w:rPr>
-        <w:t xml:space="preserve"># web interface only  (http://localhost:8000)</w:t>
-      </w:r>
-      <w:r>
-        <w:br/>
-      </w:r>
-      <w:r>
-        <w:rPr>
-          <w:rStyle w:val="ExtensionTok"/>
-        </w:rPr>
-        <w:t xml:space="preserve">python3</w:t>
-      </w:r>
-      <w:r>
-        <w:rPr>
-          <w:rStyle w:val="NormalTok"/>
-        </w:rPr>
-        <w:t xml:space="preserve"> main.py </w:t>
-      </w:r>
-      <w:r>
-        <w:rPr>
-          <w:rStyle w:val="AttributeTok"/>
-        </w:rPr>
-        <w:t xml:space="preserve">--both</w:t>
-      </w:r>
-      <w:r>
-        <w:rPr>
-          <w:rStyle w:val="NormalTok"/>
-        </w:rPr>
-        <w:t xml:space="preserve">      </w:t>
-      </w:r>
-      <w:r>
-        <w:rPr>
-          <w:rStyle w:val="CommentTok"/>
-        </w:rPr>
-        <w:t xml:space="preserve"># GUI + web server</w:t>
-      </w:r>
-      <w:r>
-        <w:br/>
-      </w:r>
-      <w:r>
-        <w:rPr>
-          <w:rStyle w:val="ExtensionTok"/>
-        </w:rPr>
-        <w:t xml:space="preserve">python3</w:t>
-      </w:r>
-      <w:r>
-        <w:rPr>
-          <w:rStyle w:val="NormalTok"/>
-        </w:rPr>
-        <w:t xml:space="preserve"> main.py </w:t>
-      </w:r>
-      <w:r>
-        <w:rPr>
-          <w:rStyle w:val="AttributeTok"/>
-        </w:rPr>
-        <w:t xml:space="preserve">--list-devices</w:t>
+    <w:bookmarkStart w:id="20" w:name="arch-cachyos"/>
+    <w:p>
+      <w:pPr>
+        <w:pStyle w:val="Heading3"/>
+      </w:pPr>
+      <w:r>
+        <w:t xml:space="preserve">Arch / CachyOS</w:t>
       </w:r>
     </w:p>
     <w:p>
@@ -204,7 +93,7 @@
         <w:pStyle w:val="FirstParagraph"/>
       </w:pPr>
       <w:r>
-        <w:t xml:space="preserve">No SDR attached? The app automatically falls back to a synthetic</w:t>
+        <w:t xml:space="preserve">Arch-based distros (including</w:t>
       </w:r>
       <w:r>
         <w:t xml:space="preserve"> </w:t>
@@ -214,6 +103,578 @@
           <w:bCs/>
           <w:b/>
         </w:rPr>
+        <w:t xml:space="preserve">CachyOS</w:t>
+      </w:r>
+      <w:r>
+        <w:t xml:space="preserve">) differ in two ways: they enforce</w:t>
+      </w:r>
+      <w:r>
+        <w:t xml:space="preserve"> </w:t>
+      </w:r>
+      <w:r>
+        <w:rPr>
+          <w:bCs/>
+          <w:b/>
+        </w:rPr>
+        <w:t xml:space="preserve">PEP 668</w:t>
+      </w:r>
+      <w:r>
+        <w:t xml:space="preserve"> </w:t>
+      </w:r>
+      <w:r>
+        <w:t xml:space="preserve">(a system-wide</w:t>
+      </w:r>
+      <w:r>
+        <w:t xml:space="preserve"> </w:t>
+      </w:r>
+      <w:r>
+        <w:rPr>
+          <w:rStyle w:val="VerbatimChar"/>
+        </w:rPr>
+        <w:t xml:space="preserve">pip install</w:t>
+      </w:r>
+      <w:r>
+        <w:t xml:space="preserve"> </w:t>
+      </w:r>
+      <w:r>
+        <w:t xml:space="preserve">is blocked, so you must use a venv), and</w:t>
+      </w:r>
+      <w:r>
+        <w:t xml:space="preserve"> </w:t>
+      </w:r>
+      <w:r>
+        <w:t xml:space="preserve">CachyOS defaults to the</w:t>
+      </w:r>
+      <w:r>
+        <w:t xml:space="preserve"> </w:t>
+      </w:r>
+      <w:r>
+        <w:rPr>
+          <w:bCs/>
+          <w:b/>
+        </w:rPr>
+        <w:t xml:space="preserve">fish</w:t>
+      </w:r>
+      <w:r>
+        <w:t xml:space="preserve"> </w:t>
+      </w:r>
+      <w:r>
+        <w:t xml:space="preserve">shell (the usual</w:t>
+      </w:r>
+      <w:r>
+        <w:t xml:space="preserve"> </w:t>
+      </w:r>
+      <w:r>
+        <w:rPr>
+          <w:rStyle w:val="VerbatimChar"/>
+        </w:rPr>
+        <w:t xml:space="preserve">activate</w:t>
+      </w:r>
+      <w:r>
+        <w:t xml:space="preserve"> </w:t>
+      </w:r>
+      <w:r>
+        <w:t xml:space="preserve">script won’t work).</w:t>
+      </w:r>
+      <w:r>
+        <w:t xml:space="preserve"> </w:t>
+      </w:r>
+      <w:r>
+        <w:rPr>
+          <w:rStyle w:val="VerbatimChar"/>
+        </w:rPr>
+        <w:t xml:space="preserve">./install_drivers.sh</w:t>
+      </w:r>
+      <w:r>
+        <w:t xml:space="preserve"> </w:t>
+      </w:r>
+      <w:r>
+        <w:t xml:space="preserve">handles this automatically, but the manual steps are:</w:t>
+      </w:r>
+    </w:p>
+    <w:p>
+      <w:pPr>
+        <w:pStyle w:val="SourceCode"/>
+      </w:pPr>
+      <w:r>
+        <w:rPr>
+          <w:rStyle w:val="CommentTok"/>
+        </w:rPr>
+        <w:t xml:space="preserve"># 1. System packages (note the Arch names: libuhd, python-pyqt6-webengine, portaudio)</w:t>
+      </w:r>
+      <w:r>
+        <w:br/>
+      </w:r>
+      <w:r>
+        <w:rPr>
+          <w:rStyle w:val="FunctionTok"/>
+        </w:rPr>
+        <w:t xml:space="preserve">sudo</w:t>
+      </w:r>
+      <w:r>
+        <w:rPr>
+          <w:rStyle w:val="NormalTok"/>
+        </w:rPr>
+        <w:t xml:space="preserve"> pacman </w:t>
+      </w:r>
+      <w:r>
+        <w:rPr>
+          <w:rStyle w:val="AttributeTok"/>
+        </w:rPr>
+        <w:t xml:space="preserve">-S</w:t>
+      </w:r>
+      <w:r>
+        <w:rPr>
+          <w:rStyle w:val="NormalTok"/>
+        </w:rPr>
+        <w:t xml:space="preserve"> </w:t>
+      </w:r>
+      <w:r>
+        <w:rPr>
+          <w:rStyle w:val="AttributeTok"/>
+        </w:rPr>
+        <w:t xml:space="preserve">--needed</w:t>
+      </w:r>
+      <w:r>
+        <w:rPr>
+          <w:rStyle w:val="NormalTok"/>
+        </w:rPr>
+        <w:t xml:space="preserve"> soapysdr soapyrtlsdr soapyhackrf soapybladerf soapyuhd libuhd </w:t>
+      </w:r>
+      <w:r>
+        <w:rPr>
+          <w:rStyle w:val="DataTypeTok"/>
+        </w:rPr>
+        <w:t xml:space="preserve">\</w:t>
+      </w:r>
+      <w:r>
+        <w:br/>
+      </w:r>
+      <w:r>
+        <w:rPr>
+          <w:rStyle w:val="NormalTok"/>
+        </w:rPr>
+        <w:t xml:space="preserve">  rtl-sdr hackrf libusb portaudio python-pyqt6 python-pyqt6-webengine</w:t>
+      </w:r>
+      <w:r>
+        <w:br/>
+      </w:r>
+      <w:r>
+        <w:br/>
+      </w:r>
+      <w:r>
+        <w:rPr>
+          <w:rStyle w:val="CommentTok"/>
+        </w:rPr>
+        <w:t xml:space="preserve"># 2. Create a venv WITH --system-site-packages (so it can see the pacman SoapySDR/PyQt6 bindings)</w:t>
+      </w:r>
+      <w:r>
+        <w:br/>
+      </w:r>
+      <w:r>
+        <w:rPr>
+          <w:rStyle w:val="ExtensionTok"/>
+        </w:rPr>
+        <w:t xml:space="preserve">python</w:t>
+      </w:r>
+      <w:r>
+        <w:rPr>
+          <w:rStyle w:val="NormalTok"/>
+        </w:rPr>
+        <w:t xml:space="preserve"> </w:t>
+      </w:r>
+      <w:r>
+        <w:rPr>
+          <w:rStyle w:val="AttributeTok"/>
+        </w:rPr>
+        <w:t xml:space="preserve">-m</w:t>
+      </w:r>
+      <w:r>
+        <w:rPr>
+          <w:rStyle w:val="NormalTok"/>
+        </w:rPr>
+        <w:t xml:space="preserve"> venv </w:t>
+      </w:r>
+      <w:r>
+        <w:rPr>
+          <w:rStyle w:val="AttributeTok"/>
+        </w:rPr>
+        <w:t xml:space="preserve">--system-site-packages</w:t>
+      </w:r>
+      <w:r>
+        <w:rPr>
+          <w:rStyle w:val="NormalTok"/>
+        </w:rPr>
+        <w:t xml:space="preserve"> .venv</w:t>
+      </w:r>
+      <w:r>
+        <w:br/>
+      </w:r>
+      <w:r>
+        <w:br/>
+      </w:r>
+      <w:r>
+        <w:rPr>
+          <w:rStyle w:val="CommentTok"/>
+        </w:rPr>
+        <w:t xml:space="preserve"># 3. Activate it — the command depends on your shell:</w:t>
+      </w:r>
+      <w:r>
+        <w:br/>
+      </w:r>
+      <w:r>
+        <w:rPr>
+          <w:rStyle w:val="BuiltInTok"/>
+        </w:rPr>
+        <w:t xml:space="preserve">source</w:t>
+      </w:r>
+      <w:r>
+        <w:rPr>
+          <w:rStyle w:val="NormalTok"/>
+        </w:rPr>
+        <w:t xml:space="preserve"> .venv/bin/activate          </w:t>
+      </w:r>
+      <w:r>
+        <w:rPr>
+          <w:rStyle w:val="CommentTok"/>
+        </w:rPr>
+        <w:t xml:space="preserve"># bash / zsh</w:t>
+      </w:r>
+      <w:r>
+        <w:br/>
+      </w:r>
+      <w:r>
+        <w:rPr>
+          <w:rStyle w:val="BuiltInTok"/>
+        </w:rPr>
+        <w:t xml:space="preserve">source</w:t>
+      </w:r>
+      <w:r>
+        <w:rPr>
+          <w:rStyle w:val="NormalTok"/>
+        </w:rPr>
+        <w:t xml:space="preserve"> .venv/bin/activate.fish     </w:t>
+      </w:r>
+      <w:r>
+        <w:rPr>
+          <w:rStyle w:val="CommentTok"/>
+        </w:rPr>
+        <w:t xml:space="preserve"># fish (CachyOS default)</w:t>
+      </w:r>
+      <w:r>
+        <w:br/>
+      </w:r>
+      <w:r>
+        <w:rPr>
+          <w:rStyle w:val="CommentTok"/>
+        </w:rPr>
+        <w:t xml:space="preserve">#   ...or skip activation and call .venv/bin/python directly.</w:t>
+      </w:r>
+      <w:r>
+        <w:br/>
+      </w:r>
+      <w:r>
+        <w:br/>
+      </w:r>
+      <w:r>
+        <w:rPr>
+          <w:rStyle w:val="CommentTok"/>
+        </w:rPr>
+        <w:t xml:space="preserve"># 4. Install the Python deps</w:t>
+      </w:r>
+      <w:r>
+        <w:br/>
+      </w:r>
+      <w:r>
+        <w:rPr>
+          <w:rStyle w:val="ExtensionTok"/>
+        </w:rPr>
+        <w:t xml:space="preserve">pip</w:t>
+      </w:r>
+      <w:r>
+        <w:rPr>
+          <w:rStyle w:val="NormalTok"/>
+        </w:rPr>
+        <w:t xml:space="preserve"> install </w:t>
+      </w:r>
+      <w:r>
+        <w:rPr>
+          <w:rStyle w:val="AttributeTok"/>
+        </w:rPr>
+        <w:t xml:space="preserve">-r</w:t>
+      </w:r>
+      <w:r>
+        <w:rPr>
+          <w:rStyle w:val="NormalTok"/>
+        </w:rPr>
+        <w:t xml:space="preserve"> requirements.txt</w:t>
+      </w:r>
+    </w:p>
+    <w:p>
+      <w:pPr>
+        <w:pStyle w:val="BlockText"/>
+      </w:pPr>
+      <w:r>
+        <w:t xml:space="preserve">Seeing</w:t>
+      </w:r>
+      <w:r>
+        <w:t xml:space="preserve"> </w:t>
+      </w:r>
+      <w:r>
+        <w:rPr>
+          <w:rStyle w:val="VerbatimChar"/>
+        </w:rPr>
+        <w:t xml:space="preserve">'case' builtin not inside of switch block</w:t>
+      </w:r>
+      <w:r>
+        <w:t xml:space="preserve">? You’re in</w:t>
+      </w:r>
+      <w:r>
+        <w:t xml:space="preserve"> </w:t>
+      </w:r>
+      <w:r>
+        <w:rPr>
+          <w:bCs/>
+          <w:b/>
+        </w:rPr>
+        <w:t xml:space="preserve">fish</w:t>
+      </w:r>
+      <w:r>
+        <w:t xml:space="preserve"> </w:t>
+      </w:r>
+      <w:r>
+        <w:t xml:space="preserve">but sourced</w:t>
+      </w:r>
+      <w:r>
+        <w:t xml:space="preserve"> </w:t>
+      </w:r>
+      <w:r>
+        <w:t xml:space="preserve">the bash</w:t>
+      </w:r>
+      <w:r>
+        <w:t xml:space="preserve"> </w:t>
+      </w:r>
+      <w:r>
+        <w:rPr>
+          <w:rStyle w:val="VerbatimChar"/>
+        </w:rPr>
+        <w:t xml:space="preserve">activate</w:t>
+      </w:r>
+      <w:r>
+        <w:t xml:space="preserve"> </w:t>
+      </w:r>
+      <w:r>
+        <w:t xml:space="preserve">script — use</w:t>
+      </w:r>
+      <w:r>
+        <w:t xml:space="preserve"> </w:t>
+      </w:r>
+      <w:r>
+        <w:rPr>
+          <w:rStyle w:val="VerbatimChar"/>
+        </w:rPr>
+        <w:t xml:space="preserve">activate.fish</w:t>
+      </w:r>
+      <w:r>
+        <w:t xml:space="preserve"> </w:t>
+      </w:r>
+      <w:r>
+        <w:t xml:space="preserve">instead.</w:t>
+      </w:r>
+      <w:r>
+        <w:t xml:space="preserve"> </w:t>
+      </w:r>
+      <w:r>
+        <w:t xml:space="preserve">Do</w:t>
+      </w:r>
+      <w:r>
+        <w:t xml:space="preserve"> </w:t>
+      </w:r>
+      <w:r>
+        <w:rPr>
+          <w:bCs/>
+          <w:b/>
+        </w:rPr>
+        <w:t xml:space="preserve">not</w:t>
+      </w:r>
+      <w:r>
+        <w:t xml:space="preserve"> </w:t>
+      </w:r>
+      <w:r>
+        <w:t xml:space="preserve">use</w:t>
+      </w:r>
+      <w:r>
+        <w:t xml:space="preserve"> </w:t>
+      </w:r>
+      <w:r>
+        <w:rPr>
+          <w:rStyle w:val="VerbatimChar"/>
+        </w:rPr>
+        <w:t xml:space="preserve">pip install --break-system-packages</w:t>
+      </w:r>
+      <w:r>
+        <w:t xml:space="preserve">; use the venv above.</w:t>
+      </w:r>
+    </w:p>
+    <w:p>
+      <w:pPr>
+        <w:pStyle w:val="BlockText"/>
+      </w:pPr>
+      <w:r>
+        <w:t xml:space="preserve">LimeSDR / PlutoSDR / SDRplay / Airspy Soapy modules are AUR-only, e.g.</w:t>
+      </w:r>
+      <w:r>
+        <w:t xml:space="preserve"> </w:t>
+      </w:r>
+      <w:r>
+        <w:rPr>
+          <w:rStyle w:val="VerbatimChar"/>
+        </w:rPr>
+        <w:t xml:space="preserve">paru -S soapylms7 soapysdrplay3 soapyairspy limesuite</w:t>
+      </w:r>
+      <w:r>
+        <w:t xml:space="preserve"> </w:t>
+      </w:r>
+      <w:r>
+        <w:t xml:space="preserve">(optional).</w:t>
+      </w:r>
+    </w:p>
+    <w:bookmarkEnd w:id="20"/>
+    <w:bookmarkEnd w:id="21"/>
+    <w:bookmarkStart w:id="22" w:name="run"/>
+    <w:p>
+      <w:pPr>
+        <w:pStyle w:val="Heading2"/>
+      </w:pPr>
+      <w:r>
+        <w:t xml:space="preserve">2. Run</w:t>
+      </w:r>
+    </w:p>
+    <w:p>
+      <w:pPr>
+        <w:pStyle w:val="SourceCode"/>
+      </w:pPr>
+      <w:r>
+        <w:rPr>
+          <w:rStyle w:val="ExtensionTok"/>
+        </w:rPr>
+        <w:t xml:space="preserve">./launch.sh</w:t>
+      </w:r>
+      <w:r>
+        <w:rPr>
+          <w:rStyle w:val="NormalTok"/>
+        </w:rPr>
+        <w:t xml:space="preserve">                 </w:t>
+      </w:r>
+      <w:r>
+        <w:rPr>
+          <w:rStyle w:val="CommentTok"/>
+        </w:rPr>
+        <w:t xml:space="preserve"># desktop GUI (same as: python3 main.py --gui)</w:t>
+      </w:r>
+      <w:r>
+        <w:br/>
+      </w:r>
+      <w:r>
+        <w:rPr>
+          <w:rStyle w:val="ExtensionTok"/>
+        </w:rPr>
+        <w:t xml:space="preserve">python3</w:t>
+      </w:r>
+      <w:r>
+        <w:rPr>
+          <w:rStyle w:val="NormalTok"/>
+        </w:rPr>
+        <w:t xml:space="preserve"> main.py </w:t>
+      </w:r>
+      <w:r>
+        <w:rPr>
+          <w:rStyle w:val="AttributeTok"/>
+        </w:rPr>
+        <w:t xml:space="preserve">--web</w:t>
+      </w:r>
+      <w:r>
+        <w:rPr>
+          <w:rStyle w:val="NormalTok"/>
+        </w:rPr>
+        <w:t xml:space="preserve">       </w:t>
+      </w:r>
+      <w:r>
+        <w:rPr>
+          <w:rStyle w:val="CommentTok"/>
+        </w:rPr>
+        <w:t xml:space="preserve"># web interface only  (http://localhost:8000)</w:t>
+      </w:r>
+      <w:r>
+        <w:br/>
+      </w:r>
+      <w:r>
+        <w:rPr>
+          <w:rStyle w:val="ExtensionTok"/>
+        </w:rPr>
+        <w:t xml:space="preserve">python3</w:t>
+      </w:r>
+      <w:r>
+        <w:rPr>
+          <w:rStyle w:val="NormalTok"/>
+        </w:rPr>
+        <w:t xml:space="preserve"> main.py </w:t>
+      </w:r>
+      <w:r>
+        <w:rPr>
+          <w:rStyle w:val="AttributeTok"/>
+        </w:rPr>
+        <w:t xml:space="preserve">--both</w:t>
+      </w:r>
+      <w:r>
+        <w:rPr>
+          <w:rStyle w:val="NormalTok"/>
+        </w:rPr>
+        <w:t xml:space="preserve">      </w:t>
+      </w:r>
+      <w:r>
+        <w:rPr>
+          <w:rStyle w:val="CommentTok"/>
+        </w:rPr>
+        <w:t xml:space="preserve"># GUI + web server</w:t>
+      </w:r>
+      <w:r>
+        <w:br/>
+      </w:r>
+      <w:r>
+        <w:rPr>
+          <w:rStyle w:val="ExtensionTok"/>
+        </w:rPr>
+        <w:t xml:space="preserve">python3</w:t>
+      </w:r>
+      <w:r>
+        <w:rPr>
+          <w:rStyle w:val="NormalTok"/>
+        </w:rPr>
+        <w:t xml:space="preserve"> main.py </w:t>
+      </w:r>
+      <w:r>
+        <w:rPr>
+          <w:rStyle w:val="AttributeTok"/>
+        </w:rPr>
+        <w:t xml:space="preserve">--list-devices</w:t>
+      </w:r>
+    </w:p>
+    <w:p>
+      <w:pPr>
+        <w:pStyle w:val="FirstParagraph"/>
+      </w:pPr>
+      <w:r>
+        <w:t xml:space="preserve">No SDR attached? The app automatically falls back to a synthetic</w:t>
+      </w:r>
+      <w:r>
+        <w:t xml:space="preserve"> </w:t>
+      </w:r>
+      <w:r>
+        <w:rPr>
+          <w:bCs/>
+          <w:b/>
+        </w:rPr>
         <w:t xml:space="preserve">mock device</w:t>
       </w:r>
       <w:r>
@@ -255,8 +716,8 @@
         <w:t xml:space="preserve">./launch.sh</w:t>
       </w:r>
     </w:p>
-    <w:bookmarkEnd w:id="21"/>
-    <w:bookmarkStart w:id="22" w:name="first-scan"/>
+    <w:bookmarkEnd w:id="22"/>
+    <w:bookmarkStart w:id="23" w:name="first-scan"/>
     <w:p>
       <w:pPr>
         <w:pStyle w:val="Heading2"/>
@@ -398,8 +859,8 @@
         <w:t xml:space="preserve">.</w:t>
       </w:r>
     </w:p>
-    <w:bookmarkEnd w:id="22"/>
-    <w:bookmarkStart w:id="23" w:name="tabs"/>
+    <w:bookmarkEnd w:id="23"/>
+    <w:bookmarkStart w:id="24" w:name="tabs"/>
     <w:p>
       <w:pPr>
         <w:pStyle w:val="Heading2"/>
@@ -558,8 +1019,8 @@
         <w:t xml:space="preserve">— browse/search 90+ known signals</w:t>
       </w:r>
     </w:p>
-    <w:bookmarkEnd w:id="23"/>
-    <w:bookmarkStart w:id="24" w:name="keyboard-shortcuts"/>
+    <w:bookmarkEnd w:id="24"/>
+    <w:bookmarkStart w:id="25" w:name="keyboard-shortcuts"/>
     <w:p>
       <w:pPr>
         <w:pStyle w:val="Heading2"/>
@@ -573,6 +1034,7 @@
         <w:tblStyle w:val="Table"/>
         <w:tblW w:type="auto" w:w="0"/>
         <w:tblLook w:firstRow="1" w:lastRow="0" w:firstColumn="0" w:lastColumn="0" w:noHBand="0" w:noVBand="0" w:val="0020"/>
+        <w:jc w:val="start"/>
       </w:tblPr>
       <w:tblGrid>
         <w:gridCol w:w="3960"/>
@@ -898,8 +1360,8 @@
         </w:tc>
       </w:tr>
     </w:tbl>
-    <w:bookmarkEnd w:id="24"/>
-    <w:bookmarkStart w:id="25" w:name="remote-web-access"/>
+    <w:bookmarkEnd w:id="25"/>
+    <w:bookmarkStart w:id="26" w:name="remote-web-access"/>
     <w:p>
       <w:pPr>
         <w:pStyle w:val="Heading2"/>
@@ -959,8 +1421,8 @@
         <w:t xml:space="preserve">from another machine on the network.</w:t>
       </w:r>
     </w:p>
-    <w:bookmarkEnd w:id="25"/>
     <w:bookmarkEnd w:id="26"/>
+    <w:bookmarkEnd w:id="27"/>
     <w:sectPr/>
   </w:body>
 </w:document>
@@ -1368,6 +1830,25 @@
       <w:jc w:val="center"/>
     </w:pPr>
   </w:style>
+  <w:style w:customStyle="1" w:styleId="AbstractTitle" w:type="paragraph">
+    <w:name w:val="Abstract Title"/>
+    <w:basedOn w:val="Normal"/>
+    <w:next w:val="Abstract"/>
+    <w:qFormat/>
+    <w:pPr>
+      <w:keepNext/>
+      <w:keepLines/>
+      <w:jc w:val="center"/>
+      <w:spacing w:after="0" w:before="300"/>
+    </w:pPr>
+    <w:rPr>
+      <w:sz w:val="20"/>
+      <w:szCs w:val="20"/>
+      <w:b/>
+      <w:color w:val="345A8A"/>
+      &gt;
+    </w:rPr>
+  </w:style>
   <w:style w:customStyle="1" w:styleId="Abstract" w:type="paragraph">
     <w:name w:val="Abstract"/>
     <w:basedOn w:val="Normal"/>
@@ -1376,7 +1857,7 @@
     <w:pPr>
       <w:keepNext/>
       <w:keepLines/>
-      <w:spacing w:after="300" w:before="300"/>
+      <w:spacing w:after="300" w:before="100"/>
     </w:pPr>
     <w:rPr>
       <w:sz w:val="20"/>

</xml_diff>